<commit_message>
Fill in major, supervisor and date on report covers
Co-Authored-By: Claude Opus 5.5 <noreply@anthropic.com>
Claude-Session: https://claude.ai/code/session_01KzV3Rdu1dnjMLHd9t9KSXD
</commit_message>
<xml_diff>
--- a/物流大作业/B23110508-王烨-物流新技术个人大作业.docx
+++ b/物流大作业/B23110508-王烨-物流新技术个人大作业.docx
@@ -366,21 +366,19 @@
           <w:sz w:val="30"/>
           <w:u w:val="single"/>
         </w:rPr>
-        <w:t xml:space="preserve">     </w:t>
+        <w:t xml:space="preserve">   邮政管理        </w:t>
       </w:r>
       <w:r>
         <w:rPr>
           <w:sz w:val="30"/>
           <w:u w:val="single"/>
         </w:rPr>
-        <w:t xml:space="preserve">       </w:t>
       </w:r>
       <w:r>
         <w:rPr>
           <w:sz w:val="30"/>
           <w:u w:val="single"/>
         </w:rPr>
-        <w:t xml:space="preserve">      </w:t>
       </w:r>
     </w:p>
     <w:p>
@@ -542,7 +540,7 @@
           <w:sz w:val="30"/>
           <w:u w:val="single"/>
         </w:rPr>
-        <w:t xml:space="preserve">  </w:t>
+        <w:t xml:space="preserve">   王怿        </w:t>
       </w:r>
       <w:r>
         <w:rPr>
@@ -550,7 +548,6 @@
           <w:sz w:val="30"/>
           <w:u w:val="single"/>
         </w:rPr>
-        <w:t xml:space="preserve">  </w:t>
       </w:r>
       <w:r>
         <w:rPr>
@@ -558,7 +555,6 @@
           <w:sz w:val="30"/>
           <w:u w:val="single"/>
         </w:rPr>
-        <w:t xml:space="preserve">  </w:t>
       </w:r>
       <w:r>
         <w:rPr>
@@ -566,7 +562,6 @@
           <w:sz w:val="30"/>
           <w:u w:val="single"/>
         </w:rPr>
-        <w:t xml:space="preserve">            </w:t>
       </w:r>
     </w:p>
     <w:p>
@@ -593,13 +588,12 @@
         <w:rPr>
           <w:u w:val="single"/>
         </w:rPr>
-        <w:t xml:space="preserve">     </w:t>
+        <w:t xml:space="preserve">   2026年10月29日        </w:t>
       </w:r>
       <w:r>
         <w:rPr>
           <w:u w:val="single"/>
         </w:rPr>
-        <w:t xml:space="preserve">                 </w:t>
       </w:r>
     </w:p>
     <w:p>

</xml_diff>

<commit_message>
Rewrite AI usage chapter with the actual research process
Co-Authored-By: Claude Opus 5.5 <noreply@anthropic.com>
Claude-Session: https://claude.ai/code/session_01KzV3Rdu1dnjMLHd9t9KSXD
</commit_message>
<xml_diff>
--- a/物流大作业/B23110508-王烨-物流新技术个人大作业.docx
+++ b/物流大作业/B23110508-王烨-物流新技术个人大作业.docx
@@ -3630,21 +3630,6 @@
     </w:p>
     <w:p>
       <w:pPr>
-        <w:spacing w:line="360" w:lineRule="auto" w:before="0" w:after="0"/>
-        <w:jc w:val="both"/>
-      </w:pPr>
-      <w:r>
-        <w:rPr>
-          <w:rFonts w:ascii="Times New Roman" w:hAnsi="Times New Roman" w:cs="Times New Roman" w:eastAsia="宋体"/>
-          <w:b w:val="0"/>
-          <w:color w:val="C00000"/>
-          <w:sz w:val="21"/>
-        </w:rPr>
-        <w:t>【提示：本章须如实记录你本人的AI使用情况。以下内容按本次作业的实际生成过程撰写；如你在此基础上自己又做了查证、修改或使用了其他AI工具，请把相应内容补充或替换进来，提交前删除本段提示。】</w:t>
-      </w:r>
-    </w:p>
-    <w:p>
-      <w:pPr>
         <w:keepNext/>
         <w:spacing w:line="360" w:lineRule="auto" w:before="120" w:after="60"/>
         <w:jc w:val="both"/>
@@ -3670,7 +3655,53 @@
           <w:b w:val="0"/>
           <w:sz w:val="24"/>
         </w:rPr>
-        <w:t>本次作业在以下环节使用了AI工具：（1）</w:t>
+        <w:t>本次作业使用的AI工具是Anthropic公司的Claude，通过Claude Code（在云端运行、可联网检索和执行程序的AI编程/办公助手）使用。需要如实说明的是：本报告的资料检索、分析框架搭建、初稿撰写、图表制作和Word排版主要由AI完成；我本人负责提供课程材料（作业要求与报告模板）、告知小组主题“AI在现代物流中的应用”、在AI给出的几种切入方式中选择“多案例对比”、提供封面信息，并对成稿进行阅读和确认。具体来说，AI参与了以下环节：</w:t>
+      </w:r>
+    </w:p>
+    <w:p>
+      <w:pPr>
+        <w:spacing w:line="360" w:lineRule="auto" w:before="0" w:after="0"/>
+        <w:ind w:firstLine="480"/>
+        <w:jc w:val="both"/>
+      </w:pPr>
+      <w:r>
+        <w:rPr>
+          <w:rFonts w:ascii="Times New Roman" w:hAnsi="Times New Roman" w:cs="Times New Roman" w:eastAsia="宋体"/>
+          <w:b w:val="0"/>
+          <w:sz w:val="24"/>
+        </w:rPr>
+        <w:t>（1）</w:t>
+      </w:r>
+      <w:r>
+        <w:rPr>
+          <w:rFonts w:ascii="Times New Roman" w:hAnsi="Times New Roman" w:cs="Times New Roman" w:eastAsia="宋体"/>
+          <w:b/>
+          <w:sz w:val="24"/>
+        </w:rPr>
+        <w:t>选题与切入点</w:t>
+      </w:r>
+      <w:r>
+        <w:rPr>
+          <w:rFonts w:ascii="Times New Roman" w:hAnsi="Times New Roman" w:cs="Times New Roman" w:eastAsia="宋体"/>
+          <w:b w:val="0"/>
+          <w:sz w:val="24"/>
+        </w:rPr>
+        <w:t>：AI读取了作业要求后，先向我询问小组主题和切入方式（给出“多案例对比”“单个案例深度拆解”“技术痛点与优化方案”等选项），我选择了“多案例对比”，AI再据此把题目收窄到“三家头部企业的物流垂直大模型”。</w:t>
+      </w:r>
+    </w:p>
+    <w:p>
+      <w:pPr>
+        <w:spacing w:line="360" w:lineRule="auto" w:before="0" w:after="0"/>
+        <w:ind w:firstLine="480"/>
+        <w:jc w:val="both"/>
+      </w:pPr>
+      <w:r>
+        <w:rPr>
+          <w:rFonts w:ascii="Times New Roman" w:hAnsi="Times New Roman" w:cs="Times New Roman" w:eastAsia="宋体"/>
+          <w:b w:val="0"/>
+          <w:sz w:val="24"/>
+        </w:rPr>
+        <w:t>（2）</w:t>
       </w:r>
       <w:r>
         <w:rPr>
@@ -3686,55 +3717,69 @@
           <w:b w:val="0"/>
           <w:sz w:val="24"/>
         </w:rPr>
-        <w:t>：检索三家企业物流大模型的发布时间、功能描述和公开数据；（2）</w:t>
-      </w:r>
-      <w:r>
-        <w:rPr>
-          <w:rFonts w:ascii="Times New Roman" w:hAnsi="Times New Roman" w:cs="Times New Roman" w:eastAsia="宋体"/>
-          <w:b/>
-          <w:sz w:val="24"/>
-        </w:rPr>
-        <w:t>框架梳理</w:t>
-      </w:r>
-      <w:r>
-        <w:rPr>
-          <w:rFonts w:ascii="Times New Roman" w:hAnsi="Times New Roman" w:cs="Times New Roman" w:eastAsia="宋体"/>
-          <w:b w:val="0"/>
-          <w:sz w:val="24"/>
-        </w:rPr>
-        <w:t>：根据作业要求和小组主题，确定“多案例对比”的切入方式和五个对比维度；（3）</w:t>
-      </w:r>
-      <w:r>
-        <w:rPr>
-          <w:rFonts w:ascii="Times New Roman" w:hAnsi="Times New Roman" w:cs="Times New Roman" w:eastAsia="宋体"/>
-          <w:b/>
-          <w:sz w:val="24"/>
-        </w:rPr>
-        <w:t>制表绘图</w:t>
-      </w:r>
-      <w:r>
-        <w:rPr>
-          <w:rFonts w:ascii="Times New Roman" w:hAnsi="Times New Roman" w:cs="Times New Roman" w:eastAsia="宋体"/>
-          <w:b w:val="0"/>
-          <w:sz w:val="24"/>
-        </w:rPr>
-        <w:t>：生成对比表格和“三层架构”对比图；（4）</w:t>
-      </w:r>
-      <w:r>
-        <w:rPr>
-          <w:rFonts w:ascii="Times New Roman" w:hAnsi="Times New Roman" w:cs="Times New Roman" w:eastAsia="宋体"/>
-          <w:b/>
-          <w:sz w:val="24"/>
-        </w:rPr>
-        <w:t>初稿撰写与排版</w:t>
-      </w:r>
-      <w:r>
-        <w:rPr>
-          <w:rFonts w:ascii="Times New Roman" w:hAnsi="Times New Roman" w:cs="Times New Roman" w:eastAsia="宋体"/>
-          <w:b w:val="0"/>
-          <w:sz w:val="24"/>
-        </w:rPr>
-        <w:t>：按照课程模板生成报告初稿和格式。</w:t>
+        <w:t>：AI共进行了9次联网搜索，检索词包括“顺丰 丰语 物流大模型 发布 客服 摘要 准确率”“顺丰 丰知 物流决策大模型 预测准确率”“京东物流 超脑 大模型 数字孪生”“京东物流 超脑大模型2.0 异狼 千万级变量”“菜鸟 天机π 供应链大模型 销量预测 补货”“国务院 关于深入实施‘人工智能+’行动的意见”以及物流大模型相关期刊论文和行业报告等。</w:t>
+      </w:r>
+    </w:p>
+    <w:p>
+      <w:pPr>
+        <w:spacing w:line="360" w:lineRule="auto" w:before="0" w:after="0"/>
+        <w:ind w:firstLine="480"/>
+        <w:jc w:val="both"/>
+      </w:pPr>
+      <w:r>
+        <w:rPr>
+          <w:rFonts w:ascii="Times New Roman" w:hAnsi="Times New Roman" w:cs="Times New Roman" w:eastAsia="宋体"/>
+          <w:b w:val="0"/>
+          <w:sz w:val="24"/>
+        </w:rPr>
+        <w:t>（3）</w:t>
+      </w:r>
+      <w:r>
+        <w:rPr>
+          <w:rFonts w:ascii="Times New Roman" w:hAnsi="Times New Roman" w:cs="Times New Roman" w:eastAsia="宋体"/>
+          <w:b/>
+          <w:sz w:val="24"/>
+        </w:rPr>
+        <w:t>分析与写作</w:t>
+      </w:r>
+      <w:r>
+        <w:rPr>
+          <w:rFonts w:ascii="Times New Roman" w:hAnsi="Times New Roman" w:cs="Times New Roman" w:eastAsia="宋体"/>
+          <w:b w:val="0"/>
+          <w:sz w:val="24"/>
+        </w:rPr>
+        <w:t>：AI根据检索结果设计了五个对比维度，归纳出“语言型/求解型/决策服务型”三条路线和“网络形态决定第一落点”等分析观点，并撰写全文初稿。</w:t>
+      </w:r>
+    </w:p>
+    <w:p>
+      <w:pPr>
+        <w:spacing w:line="360" w:lineRule="auto" w:before="0" w:after="0"/>
+        <w:ind w:firstLine="480"/>
+        <w:jc w:val="both"/>
+      </w:pPr>
+      <w:r>
+        <w:rPr>
+          <w:rFonts w:ascii="Times New Roman" w:hAnsi="Times New Roman" w:cs="Times New Roman" w:eastAsia="宋体"/>
+          <w:b w:val="0"/>
+          <w:sz w:val="24"/>
+        </w:rPr>
+        <w:t>（4）</w:t>
+      </w:r>
+      <w:r>
+        <w:rPr>
+          <w:rFonts w:ascii="Times New Roman" w:hAnsi="Times New Roman" w:cs="Times New Roman" w:eastAsia="宋体"/>
+          <w:b/>
+          <w:sz w:val="24"/>
+        </w:rPr>
+        <w:t>制表绘图与排版</w:t>
+      </w:r>
+      <w:r>
+        <w:rPr>
+          <w:rFonts w:ascii="Times New Roman" w:hAnsi="Times New Roman" w:cs="Times New Roman" w:eastAsia="宋体"/>
+          <w:b w:val="0"/>
+          <w:sz w:val="24"/>
+        </w:rPr>
+        <w:t>：AI编写Python程序，绘制图1“三层架构”对比图，生成表1至表4，并把正文套入课程Word模板、填写封面。</w:t>
       </w:r>
     </w:p>
     <w:p>
@@ -3789,7 +3834,7 @@
       <w:tr>
         <w:tc>
           <w:tcPr>
-            <w:tcW w:type="dxa" w:w="2835"/>
+            <w:tcW w:type="dxa" w:w="2381"/>
             <w:shd w:val="clear" w:fill="E7E6E6"/>
           </w:tcPr>
           <w:p>
@@ -3805,6 +3850,27 @@
                 <w:sz w:val="21"/>
               </w:rPr>
               <w:t>AI工具</w:t>
+            </w:r>
+          </w:p>
+        </w:tc>
+        <w:tc>
+          <w:tcPr>
+            <w:tcW w:type="dxa" w:w="3288"/>
+            <w:shd w:val="clear" w:fill="E7E6E6"/>
+          </w:tcPr>
+          <w:p>
+            <w:pPr>
+              <w:spacing w:line="276" w:lineRule="auto"/>
+              <w:jc w:val="center"/>
+            </w:pPr>
+            <w:r/>
+            <w:r>
+              <w:rPr>
+                <w:rFonts w:ascii="Times New Roman" w:hAnsi="Times New Roman" w:cs="Times New Roman" w:eastAsia="宋体"/>
+                <w:b/>
+                <w:sz w:val="21"/>
+              </w:rPr>
+              <w:t>使用的功能</w:t>
             </w:r>
           </w:p>
         </w:tc>
@@ -3825,27 +3891,6 @@
                 <w:b/>
                 <w:sz w:val="21"/>
               </w:rPr>
-              <w:t>使用的功能</w:t>
-            </w:r>
-          </w:p>
-        </w:tc>
-        <w:tc>
-          <w:tcPr>
-            <w:tcW w:type="dxa" w:w="2835"/>
-            <w:shd w:val="clear" w:fill="E7E6E6"/>
-          </w:tcPr>
-          <w:p>
-            <w:pPr>
-              <w:spacing w:line="276" w:lineRule="auto"/>
-              <w:jc w:val="center"/>
-            </w:pPr>
-            <w:r/>
-            <w:r>
-              <w:rPr>
-                <w:rFonts w:ascii="Times New Roman" w:hAnsi="Times New Roman" w:cs="Times New Roman" w:eastAsia="宋体"/>
-                <w:b/>
-                <w:sz w:val="21"/>
-              </w:rPr>
               <w:t>用在哪个环节</w:t>
             </w:r>
           </w:p>
@@ -3854,7 +3899,7 @@
       <w:tr>
         <w:tc>
           <w:tcPr>
-            <w:tcW w:type="dxa" w:w="2835"/>
+            <w:tcW w:type="dxa" w:w="2381"/>
           </w:tcPr>
           <w:p>
             <w:pPr>
@@ -3868,7 +3913,27 @@
                 <w:b w:val="0"/>
                 <w:sz w:val="21"/>
               </w:rPr>
-              <w:t>Claude（Anthropic，通过 Claude Code 使用）</w:t>
+              <w:t>Claude（Claude Code）</w:t>
+            </w:r>
+          </w:p>
+        </w:tc>
+        <w:tc>
+          <w:tcPr>
+            <w:tcW w:type="dxa" w:w="3288"/>
+          </w:tcPr>
+          <w:p>
+            <w:pPr>
+              <w:spacing w:line="276" w:lineRule="auto"/>
+              <w:jc w:val="center"/>
+            </w:pPr>
+            <w:r/>
+            <w:r>
+              <w:rPr>
+                <w:rFonts w:ascii="Times New Roman" w:hAnsi="Times New Roman" w:cs="Times New Roman" w:eastAsia="宋体"/>
+                <w:b w:val="0"/>
+                <w:sz w:val="21"/>
+              </w:rPr>
+              <w:t>交互式提问</w:t>
             </w:r>
           </w:p>
         </w:tc>
@@ -3888,27 +3953,7 @@
                 <w:b w:val="0"/>
                 <w:sz w:val="21"/>
               </w:rPr>
-              <w:t>联网搜索（WebSearch）、网页读取（WebFetch）</w:t>
-            </w:r>
-          </w:p>
-        </w:tc>
-        <w:tc>
-          <w:tcPr>
-            <w:tcW w:type="dxa" w:w="2835"/>
-          </w:tcPr>
-          <w:p>
-            <w:pPr>
-              <w:spacing w:line="276" w:lineRule="auto"/>
-              <w:jc w:val="left"/>
-            </w:pPr>
-            <w:r/>
-            <w:r>
-              <w:rPr>
-                <w:rFonts w:ascii="Times New Roman" w:hAnsi="Times New Roman" w:cs="Times New Roman" w:eastAsia="宋体"/>
-                <w:b w:val="0"/>
-                <w:sz w:val="21"/>
-              </w:rPr>
-              <w:t>检索三家企业的发布报道与政策文件</w:t>
+              <w:t>询问小组主题与切入方式，确定选题</w:t>
             </w:r>
           </w:p>
         </w:tc>
@@ -3916,7 +3961,7 @@
       <w:tr>
         <w:tc>
           <w:tcPr>
-            <w:tcW w:type="dxa" w:w="2835"/>
+            <w:tcW w:type="dxa" w:w="2381"/>
           </w:tcPr>
           <w:p>
             <w:pPr>
@@ -3930,7 +3975,27 @@
                 <w:b w:val="0"/>
                 <w:sz w:val="21"/>
               </w:rPr>
-              <w:t>Claude（同上）</w:t>
+              <w:t>Claude（Claude Code）</w:t>
+            </w:r>
+          </w:p>
+        </w:tc>
+        <w:tc>
+          <w:tcPr>
+            <w:tcW w:type="dxa" w:w="3288"/>
+          </w:tcPr>
+          <w:p>
+            <w:pPr>
+              <w:spacing w:line="276" w:lineRule="auto"/>
+              <w:jc w:val="left"/>
+            </w:pPr>
+            <w:r/>
+            <w:r>
+              <w:rPr>
+                <w:rFonts w:ascii="Times New Roman" w:hAnsi="Times New Roman" w:cs="Times New Roman" w:eastAsia="宋体"/>
+                <w:b w:val="0"/>
+                <w:sz w:val="21"/>
+              </w:rPr>
+              <w:t>联网搜索（WebSearch）</w:t>
             </w:r>
           </w:p>
         </w:tc>
@@ -3950,27 +4015,7 @@
                 <w:b w:val="0"/>
                 <w:sz w:val="21"/>
               </w:rPr>
-              <w:t>文本生成、结构梳理</w:t>
-            </w:r>
-          </w:p>
-        </w:tc>
-        <w:tc>
-          <w:tcPr>
-            <w:tcW w:type="dxa" w:w="2835"/>
-          </w:tcPr>
-          <w:p>
-            <w:pPr>
-              <w:spacing w:line="276" w:lineRule="auto"/>
-              <w:jc w:val="left"/>
-            </w:pPr>
-            <w:r/>
-            <w:r>
-              <w:rPr>
-                <w:rFonts w:ascii="Times New Roman" w:hAnsi="Times New Roman" w:cs="Times New Roman" w:eastAsia="宋体"/>
-                <w:b w:val="0"/>
-                <w:sz w:val="21"/>
-              </w:rPr>
-              <w:t>确定对比维度、撰写初稿</w:t>
+              <w:t>检索三家企业发布报道、政策文件与相关文献</w:t>
             </w:r>
           </w:p>
         </w:tc>
@@ -3978,7 +4023,7 @@
       <w:tr>
         <w:tc>
           <w:tcPr>
-            <w:tcW w:type="dxa" w:w="2835"/>
+            <w:tcW w:type="dxa" w:w="2381"/>
           </w:tcPr>
           <w:p>
             <w:pPr>
@@ -3992,7 +4037,27 @@
                 <w:b w:val="0"/>
                 <w:sz w:val="21"/>
               </w:rPr>
-              <w:t>Claude（同上）</w:t>
+              <w:t>Claude（Claude Code）</w:t>
+            </w:r>
+          </w:p>
+        </w:tc>
+        <w:tc>
+          <w:tcPr>
+            <w:tcW w:type="dxa" w:w="3288"/>
+          </w:tcPr>
+          <w:p>
+            <w:pPr>
+              <w:spacing w:line="276" w:lineRule="auto"/>
+              <w:jc w:val="left"/>
+            </w:pPr>
+            <w:r/>
+            <w:r>
+              <w:rPr>
+                <w:rFonts w:ascii="Times New Roman" w:hAnsi="Times New Roman" w:cs="Times New Roman" w:eastAsia="宋体"/>
+                <w:b w:val="0"/>
+                <w:sz w:val="21"/>
+              </w:rPr>
+              <w:t>网页读取（WebFetch）</w:t>
             </w:r>
           </w:p>
         </w:tc>
@@ -4012,13 +4077,15 @@
                 <w:b w:val="0"/>
                 <w:sz w:val="21"/>
               </w:rPr>
-              <w:t>运行 Python 脚本（python-docx）与 SVG 绘图</w:t>
-            </w:r>
-          </w:p>
-        </w:tc>
-        <w:tc>
-          <w:tcPr>
-            <w:tcW w:type="dxa" w:w="2835"/>
+              <w:t>尝试读取京东物流官网等原文（未成功，见7.3）</w:t>
+            </w:r>
+          </w:p>
+        </w:tc>
+      </w:tr>
+      <w:tr>
+        <w:tc>
+          <w:tcPr>
+            <w:tcW w:type="dxa" w:w="2381"/>
           </w:tcPr>
           <w:p>
             <w:pPr>
@@ -4032,7 +4099,109 @@
                 <w:b w:val="0"/>
                 <w:sz w:val="21"/>
               </w:rPr>
-              <w:t>生成表格、架构对比图，并套用课程Word模板</w:t>
+              <w:t>Claude（Claude Code）</w:t>
+            </w:r>
+          </w:p>
+        </w:tc>
+        <w:tc>
+          <w:tcPr>
+            <w:tcW w:type="dxa" w:w="3288"/>
+          </w:tcPr>
+          <w:p>
+            <w:pPr>
+              <w:spacing w:line="276" w:lineRule="auto"/>
+              <w:jc w:val="center"/>
+            </w:pPr>
+            <w:r/>
+            <w:r>
+              <w:rPr>
+                <w:rFonts w:ascii="Times New Roman" w:hAnsi="Times New Roman" w:cs="Times New Roman" w:eastAsia="宋体"/>
+                <w:b w:val="0"/>
+                <w:sz w:val="21"/>
+              </w:rPr>
+              <w:t>文本生成</w:t>
+            </w:r>
+          </w:p>
+        </w:tc>
+        <w:tc>
+          <w:tcPr>
+            <w:tcW w:type="dxa" w:w="3118"/>
+          </w:tcPr>
+          <w:p>
+            <w:pPr>
+              <w:spacing w:line="276" w:lineRule="auto"/>
+              <w:jc w:val="left"/>
+            </w:pPr>
+            <w:r/>
+            <w:r>
+              <w:rPr>
+                <w:rFonts w:ascii="Times New Roman" w:hAnsi="Times New Roman" w:cs="Times New Roman" w:eastAsia="宋体"/>
+                <w:b w:val="0"/>
+                <w:sz w:val="21"/>
+              </w:rPr>
+              <w:t>设计对比框架、撰写初稿与分析观点</w:t>
+            </w:r>
+          </w:p>
+        </w:tc>
+      </w:tr>
+      <w:tr>
+        <w:tc>
+          <w:tcPr>
+            <w:tcW w:type="dxa" w:w="2381"/>
+          </w:tcPr>
+          <w:p>
+            <w:pPr>
+              <w:spacing w:line="276" w:lineRule="auto"/>
+              <w:jc w:val="left"/>
+            </w:pPr>
+            <w:r/>
+            <w:r>
+              <w:rPr>
+                <w:rFonts w:ascii="Times New Roman" w:hAnsi="Times New Roman" w:cs="Times New Roman" w:eastAsia="宋体"/>
+                <w:b w:val="0"/>
+                <w:sz w:val="21"/>
+              </w:rPr>
+              <w:t>Claude（Claude Code）</w:t>
+            </w:r>
+          </w:p>
+        </w:tc>
+        <w:tc>
+          <w:tcPr>
+            <w:tcW w:type="dxa" w:w="3288"/>
+          </w:tcPr>
+          <w:p>
+            <w:pPr>
+              <w:spacing w:line="276" w:lineRule="auto"/>
+              <w:jc w:val="left"/>
+            </w:pPr>
+            <w:r/>
+            <w:r>
+              <w:rPr>
+                <w:rFonts w:ascii="Times New Roman" w:hAnsi="Times New Roman" w:cs="Times New Roman" w:eastAsia="宋体"/>
+                <w:b w:val="0"/>
+                <w:sz w:val="21"/>
+              </w:rPr>
+              <w:t>运行Python程序（python-docx、SVG绘图）</w:t>
+            </w:r>
+          </w:p>
+        </w:tc>
+        <w:tc>
+          <w:tcPr>
+            <w:tcW w:type="dxa" w:w="3118"/>
+          </w:tcPr>
+          <w:p>
+            <w:pPr>
+              <w:spacing w:line="276" w:lineRule="auto"/>
+              <w:jc w:val="left"/>
+            </w:pPr>
+            <w:r/>
+            <w:r>
+              <w:rPr>
+                <w:rFonts w:ascii="Times New Roman" w:hAnsi="Times New Roman" w:cs="Times New Roman" w:eastAsia="宋体"/>
+                <w:b w:val="0"/>
+                <w:sz w:val="21"/>
+              </w:rPr>
+              <w:t>绘制架构对比图、生成表格、套用Word模板</w:t>
             </w:r>
           </w:p>
         </w:tc>
@@ -4071,84 +4240,130 @@
           <w:b/>
           <w:sz w:val="24"/>
         </w:rPr>
-        <w:t>（1）数据来源核对。</w:t>
-      </w:r>
-      <w:r>
-        <w:rPr>
-          <w:rFonts w:ascii="Times New Roman" w:hAnsi="Times New Roman" w:cs="Times New Roman" w:eastAsia="宋体"/>
-          <w:b w:val="0"/>
-          <w:sz w:val="24"/>
-        </w:rPr>
-        <w:t>AI检索得到的每个数据都要求对应到具体报道，并在文中标注参考文献编号。检索过程中，AI工具对部分网站（如中国交通新闻网、京东物流官网、腾讯新闻）无法直接访问原文，只能依据搜索结果摘要，因此本文对这些数据统一以媒体转载报道为来源，并在1.4节和表2注释中说明“数据属企业自行披露”。</w:t>
-      </w:r>
-    </w:p>
-    <w:p>
-      <w:pPr>
-        <w:spacing w:line="360" w:lineRule="auto" w:before="0" w:after="0"/>
-        <w:ind w:firstLine="480"/>
-        <w:jc w:val="both"/>
-      </w:pPr>
-      <w:r>
-        <w:rPr>
-          <w:rFonts w:ascii="Times New Roman" w:hAnsi="Times New Roman" w:cs="Times New Roman" w:eastAsia="宋体"/>
-          <w:b/>
-          <w:sz w:val="24"/>
-        </w:rPr>
-        <w:t>（2）剔除无法核实的内容。</w:t>
-      </w:r>
-      <w:r>
-        <w:rPr>
-          <w:rFonts w:ascii="Times New Roman" w:hAnsi="Times New Roman" w:cs="Times New Roman" w:eastAsia="宋体"/>
-          <w:b w:val="0"/>
-          <w:sz w:val="24"/>
-        </w:rPr>
-        <w:t>检索中曾出现若干无法确认原始出处的数据，例如某行业博客称“预测准确率提升约20%”，但并非针对“天机π”；还有关于京东“超脑3.0”的二手报道和京东物流年度营收数据，因未能核对原文，本文均未采用。绘制架构对比图时，AI初稿中京东和菜鸟“交互层”的描述（如“商家用自然语言查询”）没有找到资料支撑，已改为“公开信息较少”等如实表述。</w:t>
-      </w:r>
-    </w:p>
-    <w:p>
-      <w:pPr>
-        <w:spacing w:line="360" w:lineRule="auto" w:before="0" w:after="0"/>
-        <w:ind w:firstLine="480"/>
-        <w:jc w:val="both"/>
-      </w:pPr>
-      <w:r>
-        <w:rPr>
-          <w:rFonts w:ascii="Times New Roman" w:hAnsi="Times New Roman" w:cs="Times New Roman" w:eastAsia="宋体"/>
-          <w:b/>
-          <w:sz w:val="24"/>
-        </w:rPr>
-        <w:t>（3）区分事实与观点。</w:t>
-      </w:r>
-      <w:r>
-        <w:rPr>
-          <w:rFonts w:ascii="Times New Roman" w:hAnsi="Times New Roman" w:cs="Times New Roman" w:eastAsia="宋体"/>
-          <w:b w:val="0"/>
-          <w:sz w:val="24"/>
-        </w:rPr>
-        <w:t>对于“网络形态决定第一落点”“大模型负责说清楚、小模型负责算准确”等判断，文中统一以“个人分析”“发现”“我认为”的形式呈现，与企业公开数据分开，避免把推论写成事实。</w:t>
-      </w:r>
-    </w:p>
-    <w:p>
-      <w:pPr>
-        <w:spacing w:line="360" w:lineRule="auto" w:before="0" w:after="0"/>
-        <w:ind w:firstLine="480"/>
-        <w:jc w:val="both"/>
-      </w:pPr>
-      <w:r>
-        <w:rPr>
-          <w:rFonts w:ascii="Times New Roman" w:hAnsi="Times New Roman" w:cs="Times New Roman" w:eastAsia="宋体"/>
-          <w:b/>
-          <w:sz w:val="24"/>
-        </w:rPr>
-        <w:t>（4）指标口径提醒。</w:t>
-      </w:r>
-      <w:r>
-        <w:rPr>
-          <w:rFonts w:ascii="Times New Roman" w:hAnsi="Times New Roman" w:cs="Times New Roman" w:eastAsia="宋体"/>
-          <w:b w:val="0"/>
-          <w:sz w:val="24"/>
-        </w:rPr>
-        <w:t>对“预测准确率提升5%”这类缺少基线的数据，在正文中专门指出其局限，而不是直接拿来比较。</w:t>
+        <w:t>（1）原文无法打开，只能依据搜索摘要。</w:t>
+      </w:r>
+      <w:r>
+        <w:rPr>
+          <w:rFonts w:ascii="Times New Roman" w:hAnsi="Times New Roman" w:cs="Times New Roman" w:eastAsia="宋体"/>
+          <w:b w:val="0"/>
+          <w:sz w:val="24"/>
+        </w:rPr>
+        <w:t>AI尝试直接读取中国交通新闻网、腾讯新闻和京东物流官网的原文，但这三个网站在AI运行环境的网络设置中不被允许访问，读取失败。因此文中涉及京东“超脑2.0”的数据，改为引用人民网、新浪财经等可检索到的转载报道，并在1.4节和表2注释中统一说明“数据属企业自行披露”。</w:t>
+      </w:r>
+    </w:p>
+    <w:p>
+      <w:pPr>
+        <w:spacing w:line="360" w:lineRule="auto" w:before="0" w:after="0"/>
+        <w:ind w:firstLine="480"/>
+        <w:jc w:val="both"/>
+      </w:pPr>
+      <w:r>
+        <w:rPr>
+          <w:rFonts w:ascii="Times New Roman" w:hAnsi="Times New Roman" w:cs="Times New Roman" w:eastAsia="宋体"/>
+          <w:b/>
+          <w:sz w:val="24"/>
+        </w:rPr>
+        <w:t>（2）对同一数据做多来源比对。</w:t>
+      </w:r>
+      <w:r>
+        <w:rPr>
+          <w:rFonts w:ascii="Times New Roman" w:hAnsi="Times New Roman" w:cs="Times New Roman" w:eastAsia="宋体"/>
+          <w:b w:val="0"/>
+          <w:sz w:val="24"/>
+        </w:rPr>
+        <w:t>例如顺丰“丰语”的“摘要准确率超过95%、客服处理时长减少30%”在IT之家、腾讯云开发者社区、新浪财经的报道中一致，才予以采用；“丰知”的“服务器资源需求降低”在不同报道中说法不一（有的写降低5倍，有的只写“大幅降低”），因此正文没有采用这一数据。</w:t>
+      </w:r>
+    </w:p>
+    <w:p>
+      <w:pPr>
+        <w:spacing w:line="360" w:lineRule="auto" w:before="0" w:after="0"/>
+        <w:ind w:firstLine="480"/>
+        <w:jc w:val="both"/>
+      </w:pPr>
+      <w:r>
+        <w:rPr>
+          <w:rFonts w:ascii="Times New Roman" w:hAnsi="Times New Roman" w:cs="Times New Roman" w:eastAsia="宋体"/>
+          <w:b/>
+          <w:sz w:val="24"/>
+        </w:rPr>
+        <w:t>（3）剔除无法核实的内容。</w:t>
+      </w:r>
+      <w:r>
+        <w:rPr>
+          <w:rFonts w:ascii="Times New Roman" w:hAnsi="Times New Roman" w:cs="Times New Roman" w:eastAsia="宋体"/>
+          <w:b w:val="0"/>
+          <w:sz w:val="24"/>
+        </w:rPr>
+        <w:t>检索中出现的以下信息未被采用：某行业博客称“预测准确率提升约20%”，但它并非针对“天机π”；一篇2026年的报道提到京东“超脑3.0”求解时间压缩到秒级、车辆调度率86%，但无法核对官方原文；京东物流2024年营收与利润数据仅见于搜索摘要，未核对年报原文。</w:t>
+      </w:r>
+    </w:p>
+    <w:p>
+      <w:pPr>
+        <w:spacing w:line="360" w:lineRule="auto" w:before="0" w:after="0"/>
+        <w:ind w:firstLine="480"/>
+        <w:jc w:val="both"/>
+      </w:pPr>
+      <w:r>
+        <w:rPr>
+          <w:rFonts w:ascii="Times New Roman" w:hAnsi="Times New Roman" w:cs="Times New Roman" w:eastAsia="宋体"/>
+          <w:b/>
+          <w:sz w:val="24"/>
+        </w:rPr>
+        <w:t>（4）修正AI自己生成的“无出处”细节。</w:t>
+      </w:r>
+      <w:r>
+        <w:rPr>
+          <w:rFonts w:ascii="Times New Roman" w:hAnsi="Times New Roman" w:cs="Times New Roman" w:eastAsia="宋体"/>
+          <w:b w:val="0"/>
+          <w:sz w:val="24"/>
+        </w:rPr>
+        <w:t>AI绘制图1初稿时，在京东和菜鸟的“交互层”中写了“自然语言下达规划需求”“商家用自然语言查询”，但检索资料中找不到依据。复查后改为“交互形态公开信息较少”“通用大模型调度小模型”等有出处或如实的表述。</w:t>
+      </w:r>
+    </w:p>
+    <w:p>
+      <w:pPr>
+        <w:spacing w:line="360" w:lineRule="auto" w:before="0" w:after="0"/>
+        <w:ind w:firstLine="480"/>
+        <w:jc w:val="both"/>
+      </w:pPr>
+      <w:r>
+        <w:rPr>
+          <w:rFonts w:ascii="Times New Roman" w:hAnsi="Times New Roman" w:cs="Times New Roman" w:eastAsia="宋体"/>
+          <w:b/>
+          <w:sz w:val="24"/>
+        </w:rPr>
+        <w:t>（5）区分事实与推论。</w:t>
+      </w:r>
+      <w:r>
+        <w:rPr>
+          <w:rFonts w:ascii="Times New Roman" w:hAnsi="Times New Roman" w:cs="Times New Roman" w:eastAsia="宋体"/>
+          <w:b w:val="0"/>
+          <w:sz w:val="24"/>
+        </w:rPr>
+        <w:t>“网络形态决定第一落点”“大模型负责说清楚、小模型负责算准确”等属于分析推论，文中统一以“个人分析”“发现”的形式写出，与企业公开数据分开；对“预测准确率提升5%”这类缺少基线的数据，在正文中专门说明其局限。</w:t>
+      </w:r>
+    </w:p>
+    <w:p>
+      <w:pPr>
+        <w:spacing w:line="360" w:lineRule="auto" w:before="0" w:after="0"/>
+        <w:ind w:firstLine="480"/>
+        <w:jc w:val="both"/>
+      </w:pPr>
+      <w:r>
+        <w:rPr>
+          <w:rFonts w:ascii="Times New Roman" w:hAnsi="Times New Roman" w:cs="Times New Roman" w:eastAsia="宋体"/>
+          <w:b/>
+          <w:sz w:val="24"/>
+        </w:rPr>
+        <w:t>（6）尚未完成的校验。</w:t>
+      </w:r>
+      <w:r>
+        <w:rPr>
+          <w:rFonts w:ascii="Times New Roman" w:hAnsi="Times New Roman" w:cs="Times New Roman" w:eastAsia="宋体"/>
+          <w:b w:val="0"/>
+          <w:sz w:val="24"/>
+        </w:rPr>
+        <w:t>参考文献中的链接由AI检索得到，我尚未逐一点开核对原文；论文类文献也未能通过中国知网检索补充。这是本报告资料可靠性方面需要说明的不足。</w:t>
       </w:r>
     </w:p>
     <w:p>
@@ -4186,7 +4401,7 @@
           <w:b w:val="0"/>
           <w:sz w:val="24"/>
         </w:rPr>
-        <w:t>AI在资料检索和结构梳理上效率很高，能够在短时间内把分散在多篇新闻中的发布信息汇总到一张对比表中，也能帮助快速搭建分析框架、完成格式排版。</w:t>
+        <w:t>AI的效率优势非常明显。从读取作业要求、检索资料到生成排版好的Word文档，AI在一次对话中完成了大部分工作，并能把分散在十多篇报道中的发布信息整理成一张对比表。AI在开始前主动询问小组主题和切入方式，也让选题能够承接小组作业，而不是泛泛而谈。</w:t>
       </w:r>
     </w:p>
     <w:p>
@@ -4209,7 +4424,7 @@
           <w:b w:val="0"/>
           <w:sz w:val="24"/>
         </w:rPr>
-        <w:t>AI检索结果大量来自新闻稿和转载文章，天然带有企业宣传视角；AI给出的摘要有时会把不同来源的数据混在一起，例如把顺丰“丰知”的数据与菜鸟的产品放在同一段描述中，需要逐条拆开核对。此外，AI在生成图表文字时会“顺手补全”没有出处的细节，如果不逐项检查，容易把推测写成事实。</w:t>
+        <w:t>一是信息源偏差：检索结果几乎全部来自企业新闻稿和媒体转载，天然带有宣传视角，菜鸟这类不公布数据的企业在对比中容易“吃亏”。二是摘要混淆：搜索工具返回的摘要有时把不同企业的数据放在一起，例如在查询菜鸟时返回了顺丰“丰知”的数据，需要逐条拆开。三是“自动补全”：AI在画图、写作时会顺手补上看似合理但没有出处的细节，必须逐项回查。</w:t>
       </w:r>
     </w:p>
     <w:p>
@@ -4232,7 +4447,30 @@
           <w:b w:val="0"/>
           <w:sz w:val="24"/>
         </w:rPr>
-        <w:t>AI工具无法登录中国知网等学术数据库，因此本文参考文献以公开报道和政策文件为主，学术文献偏少；部分网站无法访问原文，只能依赖搜索摘要。AI可以帮助“找到”和“组织”信息，但判断哪些信息可信、结论是否成立，仍需要研究者本人负责。今后使用时，应先用AI快速建立资料地图，再回到原始来源逐条核实。</w:t>
+        <w:t>AI无法登录中国知网等学术数据库，部分网站因网络设置无法访问，所以参考文献以公开报道为主，学术文献不足；AI生成的分析观点虽有逻辑，但是否成立仍需要研究者自己判断和负责。</w:t>
+      </w:r>
+    </w:p>
+    <w:p>
+      <w:pPr>
+        <w:spacing w:line="360" w:lineRule="auto" w:before="0" w:after="0"/>
+        <w:ind w:firstLine="480"/>
+        <w:jc w:val="both"/>
+      </w:pPr>
+      <w:r>
+        <w:rPr>
+          <w:rFonts w:ascii="Times New Roman" w:hAnsi="Times New Roman" w:cs="Times New Roman" w:eastAsia="宋体"/>
+          <w:b/>
+          <w:sz w:val="24"/>
+        </w:rPr>
+        <w:t>体会：</w:t>
+      </w:r>
+      <w:r>
+        <w:rPr>
+          <w:rFonts w:ascii="Times New Roman" w:hAnsi="Times New Roman" w:cs="Times New Roman" w:eastAsia="宋体"/>
+          <w:b w:val="0"/>
+          <w:sz w:val="24"/>
+        </w:rPr>
+        <w:t>这次使用让我认识到，AI可以大大加快“找资料、搭框架、出初稿”的速度，但它不能替代人对信息真实性的判断。下一步我需要做的是：逐条打开参考文献核对原文，并补充知网上的相关论文；今后使用AI写作业时，应该先让AI给出资料清单和出处，再由自己核实后写作，而不是直接采用成稿。</w:t>
       </w:r>
     </w:p>
     <w:p>

</xml_diff>